<commit_message>
edit [worksheet - w12]
</commit_message>
<xml_diff>
--- a/7-G-7/12-week-12/4-worksheet/Computer Worksheet G7 W12.docx
+++ b/7-G-7/12-week-12/4-worksheet/Computer Worksheet G7 W12.docx
@@ -255,7 +255,7 @@
                 <w:bCs/>
                 <w:lang w:bidi="ar-EG"/>
               </w:rPr>
-              <w:t>11</w:t>
+              <w:t>12</w:t>
             </w:r>
           </w:p>
         </w:tc>
@@ -411,7 +411,7 @@
           <w:sz w:val="36"/>
           <w:szCs w:val="36"/>
         </w:rPr>
-        <w:t>11</w:t>
+        <w:t>12</w:t>
       </w:r>
       <w:r>
         <w:rPr>
@@ -504,10 +504,10 @@
         <w:tblLook w:val="04A0" w:firstRow="1" w:lastRow="0" w:firstColumn="1" w:lastColumn="0" w:noHBand="0" w:noVBand="1"/>
       </w:tblPr>
       <w:tblGrid>
-        <w:gridCol w:w="2660"/>
+        <w:gridCol w:w="2802"/>
         <w:gridCol w:w="2835"/>
-        <w:gridCol w:w="2835"/>
-        <w:gridCol w:w="2686"/>
+        <w:gridCol w:w="2268"/>
+        <w:gridCol w:w="3111"/>
       </w:tblGrid>
       <w:tr>
         <w:trPr>
@@ -515,7 +515,7 @@
         </w:trPr>
         <w:tc>
           <w:tcPr>
-            <w:tcW w:w="2660" w:type="dxa"/>
+            <w:tcW w:w="2802" w:type="dxa"/>
             <w:vAlign w:val="center"/>
           </w:tcPr>
           <w:p>
@@ -527,28 +527,19 @@
               <w:jc w:val="center"/>
               <w:rPr>
                 <w:b/>
-                <w:sz w:val="44"/>
-                <w:szCs w:val="44"/>
+                <w:sz w:val="56"/>
+                <w:szCs w:val="56"/>
                 <w:lang w:bidi="ar-EG"/>
               </w:rPr>
             </w:pPr>
             <w:r>
               <w:rPr>
                 <w:b/>
-                <w:sz w:val="44"/>
-                <w:szCs w:val="44"/>
+                <w:sz w:val="56"/>
+                <w:szCs w:val="56"/>
                 <w:lang w:bidi="ar-EG"/>
               </w:rPr>
-              <w:t>D</w:t>
-            </w:r>
-            <w:r>
-              <w:rPr>
-                <w:b/>
-                <w:sz w:val="44"/>
-                <w:szCs w:val="44"/>
-                <w:lang w:bidi="ar-EG"/>
-              </w:rPr>
-              <w:t>ownload</w:t>
+              <w:t>href</w:t>
             </w:r>
           </w:p>
         </w:tc>
@@ -566,25 +557,25 @@
               <w:jc w:val="center"/>
               <w:rPr>
                 <w:b/>
-                <w:sz w:val="44"/>
-                <w:szCs w:val="44"/>
+                <w:sz w:val="56"/>
+                <w:szCs w:val="56"/>
                 <w:lang w:bidi="ar-EG"/>
               </w:rPr>
             </w:pPr>
             <w:r>
               <w:rPr>
                 <w:b/>
-                <w:sz w:val="44"/>
-                <w:szCs w:val="44"/>
+                <w:sz w:val="56"/>
+                <w:szCs w:val="56"/>
                 <w:lang w:bidi="ar-EG"/>
               </w:rPr>
-              <w:t>Click here</w:t>
+              <w:t>Press Here</w:t>
             </w:r>
           </w:p>
         </w:tc>
         <w:tc>
           <w:tcPr>
-            <w:tcW w:w="2835" w:type="dxa"/>
+            <w:tcW w:w="2268" w:type="dxa"/>
             <w:vAlign w:val="center"/>
           </w:tcPr>
           <w:p>
@@ -596,25 +587,25 @@
               <w:jc w:val="center"/>
               <w:rPr>
                 <w:b/>
-                <w:sz w:val="44"/>
-                <w:szCs w:val="44"/>
+                <w:sz w:val="56"/>
+                <w:szCs w:val="56"/>
                 <w:lang w:bidi="ar-EG"/>
               </w:rPr>
             </w:pPr>
             <w:r>
               <w:rPr>
                 <w:b/>
-                <w:sz w:val="44"/>
-                <w:szCs w:val="44"/>
+                <w:sz w:val="56"/>
+                <w:szCs w:val="56"/>
                 <w:lang w:bidi="ar-EG"/>
               </w:rPr>
-              <w:t>Upload</w:t>
+              <w:t>Close</w:t>
             </w:r>
           </w:p>
         </w:tc>
         <w:tc>
           <w:tcPr>
-            <w:tcW w:w="2686" w:type="dxa"/>
+            <w:tcW w:w="3111" w:type="dxa"/>
             <w:vAlign w:val="center"/>
           </w:tcPr>
           <w:p>
@@ -626,19 +617,28 @@
               <w:jc w:val="center"/>
               <w:rPr>
                 <w:b/>
-                <w:sz w:val="44"/>
-                <w:szCs w:val="44"/>
+                <w:sz w:val="56"/>
+                <w:szCs w:val="56"/>
                 <w:lang w:bidi="ar-EG"/>
               </w:rPr>
             </w:pPr>
             <w:r>
               <w:rPr>
                 <w:b/>
-                <w:sz w:val="44"/>
-                <w:szCs w:val="44"/>
+                <w:sz w:val="56"/>
+                <w:szCs w:val="56"/>
                 <w:lang w:bidi="ar-EG"/>
               </w:rPr>
-              <w:t>Arrow Right</w:t>
+              <w:t xml:space="preserve">Arrow </w:t>
+            </w:r>
+            <w:r>
+              <w:rPr>
+                <w:b/>
+                <w:sz w:val="56"/>
+                <w:szCs w:val="56"/>
+                <w:lang w:bidi="ar-EG"/>
+              </w:rPr>
+              <w:t>Left</w:t>
             </w:r>
           </w:p>
         </w:tc>
@@ -666,7 +666,78 @@
           <w:lang w:bidi="ar-EG"/>
         </w:rPr>
         <w:drawing>
-          <wp:anchor distT="0" distB="0" distL="114300" distR="114300" simplePos="0" relativeHeight="251679232" behindDoc="0" locked="0" layoutInCell="1" allowOverlap="1" wp14:anchorId="6E004AF1" wp14:editId="7DDA7DC5">
+          <wp:anchor distT="0" distB="0" distL="114300" distR="114300" simplePos="0" relativeHeight="251668480" behindDoc="0" locked="0" layoutInCell="1" allowOverlap="1" wp14:anchorId="11ADD998" wp14:editId="3A7F780F">
+            <wp:simplePos x="0" y="0"/>
+            <wp:positionH relativeFrom="column">
+              <wp:posOffset>405976</wp:posOffset>
+            </wp:positionH>
+            <wp:positionV relativeFrom="paragraph">
+              <wp:posOffset>186478</wp:posOffset>
+            </wp:positionV>
+            <wp:extent cx="1524424" cy="1524424"/>
+            <wp:effectExtent l="0" t="0" r="0" b="0"/>
+            <wp:wrapNone/>
+            <wp:docPr id="1430245952" name="Picture 8"/>
+            <wp:cNvGraphicFramePr>
+              <a:graphicFrameLocks xmlns:a="http://schemas.openxmlformats.org/drawingml/2006/main" noChangeAspect="1"/>
+            </wp:cNvGraphicFramePr>
+            <a:graphic xmlns:a="http://schemas.openxmlformats.org/drawingml/2006/main">
+              <a:graphicData uri="http://schemas.openxmlformats.org/drawingml/2006/picture">
+                <pic:pic xmlns:pic="http://schemas.openxmlformats.org/drawingml/2006/picture">
+                  <pic:nvPicPr>
+                    <pic:cNvPr id="0" name="Picture 1"/>
+                    <pic:cNvPicPr>
+                      <a:picLocks noChangeAspect="1" noChangeArrowheads="1"/>
+                    </pic:cNvPicPr>
+                  </pic:nvPicPr>
+                  <pic:blipFill>
+                    <a:blip r:embed="rId8" cstate="print">
+                      <a:extLst>
+                        <a:ext uri="{28A0092B-C50C-407E-A947-70E740481C1C}">
+                          <a14:useLocalDpi xmlns:a14="http://schemas.microsoft.com/office/drawing/2010/main" val="0"/>
+                        </a:ext>
+                      </a:extLst>
+                    </a:blip>
+                    <a:srcRect/>
+                    <a:stretch>
+                      <a:fillRect/>
+                    </a:stretch>
+                  </pic:blipFill>
+                  <pic:spPr bwMode="auto">
+                    <a:xfrm>
+                      <a:off x="0" y="0"/>
+                      <a:ext cx="1525970" cy="1525970"/>
+                    </a:xfrm>
+                    <a:prstGeom prst="rect">
+                      <a:avLst/>
+                    </a:prstGeom>
+                    <a:noFill/>
+                    <a:ln>
+                      <a:noFill/>
+                    </a:ln>
+                  </pic:spPr>
+                </pic:pic>
+              </a:graphicData>
+            </a:graphic>
+            <wp14:sizeRelH relativeFrom="margin">
+              <wp14:pctWidth>0</wp14:pctWidth>
+            </wp14:sizeRelH>
+            <wp14:sizeRelV relativeFrom="margin">
+              <wp14:pctHeight>0</wp14:pctHeight>
+            </wp14:sizeRelV>
+          </wp:anchor>
+        </w:drawing>
+      </w:r>
+      <w:r>
+        <w:rPr>
+          <w:b/>
+          <w:noProof/>
+          <w:sz w:val="44"/>
+          <w:szCs w:val="44"/>
+          <w:lang w:bidi="ar-EG"/>
+        </w:rPr>
+        <w:drawing>
+          <wp:anchor distT="0" distB="0" distL="114300" distR="114300" simplePos="0" relativeHeight="251663360" behindDoc="0" locked="0" layoutInCell="1" allowOverlap="1" wp14:anchorId="6E004AF1" wp14:editId="6863E725">
             <wp:simplePos x="0" y="0"/>
             <wp:positionH relativeFrom="column">
               <wp:posOffset>4919345</wp:posOffset>
@@ -691,7 +762,7 @@
                     </pic:cNvPicPr>
                   </pic:nvPicPr>
                   <pic:blipFill rotWithShape="1">
-                    <a:blip r:embed="rId8" cstate="print">
+                    <a:blip r:embed="rId9" cstate="print">
                       <a:extLst>
                         <a:ext uri="{28A0092B-C50C-407E-A947-70E740481C1C}">
                           <a14:useLocalDpi xmlns:a14="http://schemas.microsoft.com/office/drawing/2010/main" val="0"/>
@@ -747,77 +818,6 @@
           <w:lang w:bidi="ar-EG"/>
         </w:rPr>
       </w:pPr>
-      <w:r>
-        <w:rPr>
-          <w:b/>
-          <w:noProof/>
-          <w:sz w:val="44"/>
-          <w:szCs w:val="44"/>
-          <w:lang w:bidi="ar-EG"/>
-        </w:rPr>
-        <w:drawing>
-          <wp:anchor distT="0" distB="0" distL="114300" distR="114300" simplePos="0" relativeHeight="251663872" behindDoc="0" locked="0" layoutInCell="1" allowOverlap="1" wp14:anchorId="0F64E957" wp14:editId="2DB49969">
-            <wp:simplePos x="0" y="0"/>
-            <wp:positionH relativeFrom="column">
-              <wp:posOffset>-140970</wp:posOffset>
-            </wp:positionH>
-            <wp:positionV relativeFrom="paragraph">
-              <wp:posOffset>66675</wp:posOffset>
-            </wp:positionV>
-            <wp:extent cx="3447146" cy="1058084"/>
-            <wp:effectExtent l="0" t="0" r="1270" b="8890"/>
-            <wp:wrapNone/>
-            <wp:docPr id="1995347392" name="Picture 4"/>
-            <wp:cNvGraphicFramePr>
-              <a:graphicFrameLocks xmlns:a="http://schemas.openxmlformats.org/drawingml/2006/main" noChangeAspect="1"/>
-            </wp:cNvGraphicFramePr>
-            <a:graphic xmlns:a="http://schemas.openxmlformats.org/drawingml/2006/main">
-              <a:graphicData uri="http://schemas.openxmlformats.org/drawingml/2006/picture">
-                <pic:pic xmlns:pic="http://schemas.openxmlformats.org/drawingml/2006/picture">
-                  <pic:nvPicPr>
-                    <pic:cNvPr id="0" name="Picture 2"/>
-                    <pic:cNvPicPr>
-                      <a:picLocks noChangeAspect="1" noChangeArrowheads="1"/>
-                    </pic:cNvPicPr>
-                  </pic:nvPicPr>
-                  <pic:blipFill>
-                    <a:blip r:embed="rId9">
-                      <a:extLst>
-                        <a:ext uri="{28A0092B-C50C-407E-A947-70E740481C1C}">
-                          <a14:useLocalDpi xmlns:a14="http://schemas.microsoft.com/office/drawing/2010/main" val="0"/>
-                        </a:ext>
-                      </a:extLst>
-                    </a:blip>
-                    <a:srcRect/>
-                    <a:stretch>
-                      <a:fillRect/>
-                    </a:stretch>
-                  </pic:blipFill>
-                  <pic:spPr bwMode="auto">
-                    <a:xfrm>
-                      <a:off x="0" y="0"/>
-                      <a:ext cx="3447146" cy="1058084"/>
-                    </a:xfrm>
-                    <a:prstGeom prst="rect">
-                      <a:avLst/>
-                    </a:prstGeom>
-                    <a:noFill/>
-                    <a:ln>
-                      <a:noFill/>
-                    </a:ln>
-                  </pic:spPr>
-                </pic:pic>
-              </a:graphicData>
-            </a:graphic>
-            <wp14:sizeRelH relativeFrom="margin">
-              <wp14:pctWidth>0</wp14:pctWidth>
-            </wp14:sizeRelH>
-            <wp14:sizeRelV relativeFrom="margin">
-              <wp14:pctHeight>0</wp14:pctHeight>
-            </wp14:sizeRelV>
-          </wp:anchor>
-        </w:drawing>
-      </w:r>
     </w:p>
     <w:p>
       <w:pPr>
@@ -844,7 +844,353 @@
         <mc:AlternateContent>
           <mc:Choice Requires="wps">
             <w:drawing>
-              <wp:anchor distT="45720" distB="45720" distL="114300" distR="114300" simplePos="0" relativeHeight="251675648" behindDoc="0" locked="0" layoutInCell="1" allowOverlap="1" wp14:anchorId="3EF0D277" wp14:editId="6608DF22">
+              <wp:anchor distT="45720" distB="45720" distL="114300" distR="114300" simplePos="0" relativeHeight="251671040" behindDoc="0" locked="0" layoutInCell="1" allowOverlap="1" wp14:anchorId="3E600F7B" wp14:editId="06CCC908">
+                <wp:simplePos x="0" y="0"/>
+                <wp:positionH relativeFrom="column">
+                  <wp:posOffset>67733</wp:posOffset>
+                </wp:positionH>
+                <wp:positionV relativeFrom="paragraph">
+                  <wp:posOffset>2031787</wp:posOffset>
+                </wp:positionV>
+                <wp:extent cx="4377267" cy="2484967"/>
+                <wp:effectExtent l="0" t="0" r="0" b="0"/>
+                <wp:wrapNone/>
+                <wp:docPr id="463417767" name="Text Box 2"/>
+                <wp:cNvGraphicFramePr>
+                  <a:graphicFrameLocks xmlns:a="http://schemas.openxmlformats.org/drawingml/2006/main"/>
+                </wp:cNvGraphicFramePr>
+                <a:graphic xmlns:a="http://schemas.openxmlformats.org/drawingml/2006/main">
+                  <a:graphicData uri="http://schemas.microsoft.com/office/word/2010/wordprocessingShape">
+                    <wps:wsp>
+                      <wps:cNvSpPr txBox="1">
+                        <a:spLocks noChangeArrowheads="1"/>
+                      </wps:cNvSpPr>
+                      <wps:spPr bwMode="auto">
+                        <a:xfrm>
+                          <a:off x="0" y="0"/>
+                          <a:ext cx="4377267" cy="2484967"/>
+                        </a:xfrm>
+                        <a:prstGeom prst="rect">
+                          <a:avLst/>
+                        </a:prstGeom>
+                        <a:noFill/>
+                        <a:ln w="9525">
+                          <a:noFill/>
+                          <a:miter lim="800000"/>
+                          <a:headEnd/>
+                          <a:tailEnd/>
+                        </a:ln>
+                      </wps:spPr>
+                      <wps:txbx>
+                        <w:txbxContent>
+                          <w:p>
+                            <w:pPr>
+                              <w:bidi w:val="0"/>
+                              <w:rPr>
+                                <w:sz w:val="56"/>
+                                <w:szCs w:val="56"/>
+                              </w:rPr>
+                            </w:pPr>
+                            <w:r>
+                              <w:rPr>
+                                <w:sz w:val="56"/>
+                                <w:szCs w:val="56"/>
+                              </w:rPr>
+                              <w:t xml:space="preserve">&lt;a </w:t>
+                            </w:r>
+                            <w:r>
+                              <w:rPr>
+                                <w:sz w:val="56"/>
+                                <w:szCs w:val="56"/>
+                              </w:rPr>
+                              <w:t>……………</w:t>
+                            </w:r>
+                            <w:r>
+                              <w:rPr>
+                                <w:sz w:val="56"/>
+                                <w:szCs w:val="56"/>
+                              </w:rPr>
+                              <w:t>……</w:t>
+                            </w:r>
+                            <w:r>
+                              <w:rPr>
+                                <w:sz w:val="56"/>
+                                <w:szCs w:val="56"/>
+                              </w:rPr>
+                              <w:t>="https://www.facebook.com/"</w:t>
+                            </w:r>
+                          </w:p>
+                          <w:p>
+                            <w:pPr>
+                              <w:bidi w:val="0"/>
+                              <w:rPr>
+                                <w:sz w:val="56"/>
+                                <w:szCs w:val="56"/>
+                              </w:rPr>
+                            </w:pPr>
+                            <w:r>
+                              <w:rPr>
+                                <w:sz w:val="56"/>
+                                <w:szCs w:val="56"/>
+                              </w:rPr>
+                              <w:t>&gt;</w:t>
+                            </w:r>
+                          </w:p>
+                          <w:p>
+                            <w:pPr>
+                              <w:bidi w:val="0"/>
+                              <w:rPr>
+                                <w:sz w:val="56"/>
+                                <w:szCs w:val="56"/>
+                              </w:rPr>
+                            </w:pPr>
+                            <w:r>
+                              <w:rPr>
+                                <w:sz w:val="56"/>
+                                <w:szCs w:val="56"/>
+                              </w:rPr>
+                              <w:t>Click Here</w:t>
+                            </w:r>
+                          </w:p>
+                          <w:p>
+                            <w:pPr>
+                              <w:bidi w:val="0"/>
+                              <w:rPr>
+                                <w:sz w:val="56"/>
+                                <w:szCs w:val="56"/>
+                              </w:rPr>
+                            </w:pPr>
+                            <w:r>
+                              <w:rPr>
+                                <w:sz w:val="56"/>
+                                <w:szCs w:val="56"/>
+                              </w:rPr>
+                              <w:t>&lt;/a&gt;</w:t>
+                            </w:r>
+                          </w:p>
+                          <w:p>
+                            <w:pPr>
+                              <w:bidi w:val="0"/>
+                              <w:rPr>
+                                <w:rFonts w:hint="cs"/>
+                                <w:sz w:val="56"/>
+                                <w:szCs w:val="56"/>
+                                <w:lang w:bidi="ar-EG"/>
+                              </w:rPr>
+                            </w:pPr>
+                          </w:p>
+                        </w:txbxContent>
+                      </wps:txbx>
+                      <wps:bodyPr rot="0" vert="horz" wrap="square" lIns="91440" tIns="45720" rIns="91440" bIns="45720" anchor="t" anchorCtr="0">
+                        <a:noAutofit/>
+                      </wps:bodyPr>
+                    </wps:wsp>
+                  </a:graphicData>
+                </a:graphic>
+                <wp14:sizeRelH relativeFrom="margin">
+                  <wp14:pctWidth>0</wp14:pctWidth>
+                </wp14:sizeRelH>
+                <wp14:sizeRelV relativeFrom="margin">
+                  <wp14:pctHeight>0</wp14:pctHeight>
+                </wp14:sizeRelV>
+              </wp:anchor>
+            </w:drawing>
+          </mc:Choice>
+          <mc:Fallback>
+            <w:pict>
+              <v:shapetype w14:anchorId="3E600F7B" id="_x0000_t202" coordsize="21600,21600" o:spt="202" path="m,l,21600r21600,l21600,xe">
+                <v:stroke joinstyle="miter"/>
+                <v:path gradientshapeok="t" o:connecttype="rect"/>
+              </v:shapetype>
+              <v:shape id="Text Box 2" o:spid="_x0000_s1026" type="#_x0000_t202" style="position:absolute;margin-left:5.35pt;margin-top:160pt;width:344.65pt;height:195.65pt;z-index:251671040;visibility:visible;mso-wrap-style:square;mso-width-percent:0;mso-height-percent:0;mso-wrap-distance-left:9pt;mso-wrap-distance-top:3.6pt;mso-wrap-distance-right:9pt;mso-wrap-distance-bottom:3.6pt;mso-position-horizontal:absolute;mso-position-horizontal-relative:text;mso-position-vertical:absolute;mso-position-vertical-relative:text;mso-width-percent:0;mso-height-percent:0;mso-width-relative:margin;mso-height-relative:margin;v-text-anchor:top" o:gfxdata="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" filled="f" stroked="f">
+                <v:textbox>
+                  <w:txbxContent>
+                    <w:p>
+                      <w:pPr>
+                        <w:bidi w:val="0"/>
+                        <w:rPr>
+                          <w:sz w:val="56"/>
+                          <w:szCs w:val="56"/>
+                        </w:rPr>
+                      </w:pPr>
+                      <w:r>
+                        <w:rPr>
+                          <w:sz w:val="56"/>
+                          <w:szCs w:val="56"/>
+                        </w:rPr>
+                        <w:t xml:space="preserve">&lt;a </w:t>
+                      </w:r>
+                      <w:r>
+                        <w:rPr>
+                          <w:sz w:val="56"/>
+                          <w:szCs w:val="56"/>
+                        </w:rPr>
+                        <w:t>……………</w:t>
+                      </w:r>
+                      <w:r>
+                        <w:rPr>
+                          <w:sz w:val="56"/>
+                          <w:szCs w:val="56"/>
+                        </w:rPr>
+                        <w:t>……</w:t>
+                      </w:r>
+                      <w:r>
+                        <w:rPr>
+                          <w:sz w:val="56"/>
+                          <w:szCs w:val="56"/>
+                        </w:rPr>
+                        <w:t>="https://www.facebook.com/"</w:t>
+                      </w:r>
+                    </w:p>
+                    <w:p>
+                      <w:pPr>
+                        <w:bidi w:val="0"/>
+                        <w:rPr>
+                          <w:sz w:val="56"/>
+                          <w:szCs w:val="56"/>
+                        </w:rPr>
+                      </w:pPr>
+                      <w:r>
+                        <w:rPr>
+                          <w:sz w:val="56"/>
+                          <w:szCs w:val="56"/>
+                        </w:rPr>
+                        <w:t>&gt;</w:t>
+                      </w:r>
+                    </w:p>
+                    <w:p>
+                      <w:pPr>
+                        <w:bidi w:val="0"/>
+                        <w:rPr>
+                          <w:sz w:val="56"/>
+                          <w:szCs w:val="56"/>
+                        </w:rPr>
+                      </w:pPr>
+                      <w:r>
+                        <w:rPr>
+                          <w:sz w:val="56"/>
+                          <w:szCs w:val="56"/>
+                        </w:rPr>
+                        <w:t>Click Here</w:t>
+                      </w:r>
+                    </w:p>
+                    <w:p>
+                      <w:pPr>
+                        <w:bidi w:val="0"/>
+                        <w:rPr>
+                          <w:sz w:val="56"/>
+                          <w:szCs w:val="56"/>
+                        </w:rPr>
+                      </w:pPr>
+                      <w:r>
+                        <w:rPr>
+                          <w:sz w:val="56"/>
+                          <w:szCs w:val="56"/>
+                        </w:rPr>
+                        <w:t>&lt;/a&gt;</w:t>
+                      </w:r>
+                    </w:p>
+                    <w:p>
+                      <w:pPr>
+                        <w:bidi w:val="0"/>
+                        <w:rPr>
+                          <w:rFonts w:hint="cs"/>
+                          <w:sz w:val="56"/>
+                          <w:szCs w:val="56"/>
+                          <w:lang w:bidi="ar-EG"/>
+                        </w:rPr>
+                      </w:pPr>
+                    </w:p>
+                  </w:txbxContent>
+                </v:textbox>
+              </v:shape>
+            </w:pict>
+          </mc:Fallback>
+        </mc:AlternateContent>
+      </w:r>
+      <w:r>
+        <w:rPr>
+          <w:b/>
+          <w:noProof/>
+          <w:sz w:val="44"/>
+          <w:szCs w:val="44"/>
+          <w:lang w:bidi="ar-EG"/>
+        </w:rPr>
+        <w:drawing>
+          <wp:anchor distT="0" distB="0" distL="114300" distR="114300" simplePos="0" relativeHeight="251655168" behindDoc="0" locked="0" layoutInCell="1" allowOverlap="1" wp14:anchorId="153AE360" wp14:editId="732DE78E">
+            <wp:simplePos x="0" y="0"/>
+            <wp:positionH relativeFrom="column">
+              <wp:posOffset>4748742</wp:posOffset>
+            </wp:positionH>
+            <wp:positionV relativeFrom="paragraph">
+              <wp:posOffset>1961939</wp:posOffset>
+            </wp:positionV>
+            <wp:extent cx="1419226" cy="1419226"/>
+            <wp:effectExtent l="0" t="0" r="0" b="0"/>
+            <wp:wrapNone/>
+            <wp:docPr id="1855672123" name="Picture 5"/>
+            <wp:cNvGraphicFramePr>
+              <a:graphicFrameLocks xmlns:a="http://schemas.openxmlformats.org/drawingml/2006/main" noChangeAspect="1"/>
+            </wp:cNvGraphicFramePr>
+            <a:graphic xmlns:a="http://schemas.openxmlformats.org/drawingml/2006/main">
+              <a:graphicData uri="http://schemas.openxmlformats.org/drawingml/2006/picture">
+                <pic:pic xmlns:pic="http://schemas.openxmlformats.org/drawingml/2006/picture">
+                  <pic:nvPicPr>
+                    <pic:cNvPr id="0" name="Picture 3"/>
+                    <pic:cNvPicPr>
+                      <a:picLocks noChangeAspect="1" noChangeArrowheads="1"/>
+                    </pic:cNvPicPr>
+                  </pic:nvPicPr>
+                  <pic:blipFill>
+                    <a:blip r:embed="rId10">
+                      <a:extLst>
+                        <a:ext uri="{28A0092B-C50C-407E-A947-70E740481C1C}">
+                          <a14:useLocalDpi xmlns:a14="http://schemas.microsoft.com/office/drawing/2010/main" val="0"/>
+                        </a:ext>
+                      </a:extLst>
+                    </a:blip>
+                    <a:srcRect/>
+                    <a:stretch>
+                      <a:fillRect/>
+                    </a:stretch>
+                  </pic:blipFill>
+                  <pic:spPr bwMode="auto">
+                    <a:xfrm flipH="1">
+                      <a:off x="0" y="0"/>
+                      <a:ext cx="1419226" cy="1419226"/>
+                    </a:xfrm>
+                    <a:prstGeom prst="rect">
+                      <a:avLst/>
+                    </a:prstGeom>
+                    <a:noFill/>
+                    <a:ln>
+                      <a:noFill/>
+                    </a:ln>
+                  </pic:spPr>
+                </pic:pic>
+              </a:graphicData>
+            </a:graphic>
+            <wp14:sizeRelH relativeFrom="margin">
+              <wp14:pctWidth>0</wp14:pctWidth>
+            </wp14:sizeRelH>
+            <wp14:sizeRelV relativeFrom="margin">
+              <wp14:pctHeight>0</wp14:pctHeight>
+            </wp14:sizeRelV>
+          </wp:anchor>
+        </w:drawing>
+      </w:r>
+      <w:r>
+        <w:rPr>
+          <w:bCs/>
+          <w:noProof/>
+          <w:sz w:val="40"/>
+          <w:szCs w:val="40"/>
+          <w:lang w:bidi="ar-EG"/>
+        </w:rPr>
+        <mc:AlternateContent>
+          <mc:Choice Requires="wps">
+            <w:drawing>
+              <wp:anchor distT="45720" distB="45720" distL="114300" distR="114300" simplePos="0" relativeHeight="251653120" behindDoc="0" locked="0" layoutInCell="1" allowOverlap="1" wp14:anchorId="3EF0D277" wp14:editId="6608DF22">
                 <wp:simplePos x="0" y="0"/>
                 <wp:positionH relativeFrom="column">
                   <wp:posOffset>3971925</wp:posOffset>
@@ -900,7 +1246,7 @@
                                 <w:sz w:val="56"/>
                                 <w:szCs w:val="56"/>
                               </w:rPr>
-                              <w:t>Click</w:t>
+                              <w:t xml:space="preserve">Press </w:t>
                             </w:r>
                           </w:p>
                         </w:txbxContent>
@@ -922,11 +1268,7 @@
           </mc:Choice>
           <mc:Fallback>
             <w:pict>
-              <v:shapetype w14:anchorId="3EF0D277" id="_x0000_t202" coordsize="21600,21600" o:spt="202" path="m,l,21600r21600,l21600,xe">
-                <v:stroke joinstyle="miter"/>
-                <v:path gradientshapeok="t" o:connecttype="rect"/>
-              </v:shapetype>
-              <v:shape id="Text Box 2" o:spid="_x0000_s1026" type="#_x0000_t202" style="position:absolute;margin-left:312.75pt;margin-top:103.3pt;width:185.9pt;height:110.6pt;z-index:251675648;visibility:visible;mso-wrap-style:square;mso-width-percent:400;mso-height-percent:200;mso-wrap-distance-left:9pt;mso-wrap-distance-top:3.6pt;mso-wrap-distance-right:9pt;mso-wrap-distance-bottom:3.6pt;mso-position-horizontal:absolute;mso-position-horizontal-relative:text;mso-position-vertical:absolute;mso-position-vertical-relative:text;mso-width-percent:400;mso-height-percent:200;mso-width-relative:margin;mso-height-relative:margin;v-text-anchor:top" o:gfxdata="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" filled="f" stroked="f">
+              <v:shape w14:anchorId="3EF0D277" id="_x0000_s1027" type="#_x0000_t202" style="position:absolute;margin-left:312.75pt;margin-top:103.3pt;width:185.9pt;height:110.6pt;z-index:251653120;visibility:visible;mso-wrap-style:square;mso-width-percent:400;mso-height-percent:200;mso-wrap-distance-left:9pt;mso-wrap-distance-top:3.6pt;mso-wrap-distance-right:9pt;mso-wrap-distance-bottom:3.6pt;mso-position-horizontal:absolute;mso-position-horizontal-relative:text;mso-position-vertical:absolute;mso-position-vertical-relative:text;mso-width-percent:400;mso-height-percent:200;mso-width-relative:margin;mso-height-relative:margin;v-text-anchor:top" o:gfxdata="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" filled="f" stroked="f">
                 <v:textbox style="mso-fit-shape-to-text:t">
                   <w:txbxContent>
                     <w:p>
@@ -946,7 +1288,7 @@
                           <w:sz w:val="56"/>
                           <w:szCs w:val="56"/>
                         </w:rPr>
-                        <w:t>Click</w:t>
+                        <w:t xml:space="preserve">Press </w:t>
                       </w:r>
                     </w:p>
                   </w:txbxContent>
@@ -967,7 +1309,7 @@
         <mc:AlternateContent>
           <mc:Choice Requires="wps">
             <w:drawing>
-              <wp:anchor distT="0" distB="0" distL="114300" distR="114300" simplePos="0" relativeHeight="251673600" behindDoc="0" locked="0" layoutInCell="1" allowOverlap="1" wp14:anchorId="1FD9C166" wp14:editId="7C263851">
+              <wp:anchor distT="0" distB="0" distL="114300" distR="114300" simplePos="0" relativeHeight="251651072" behindDoc="0" locked="0" layoutInCell="1" allowOverlap="1" wp14:anchorId="1FD9C166" wp14:editId="7C263851">
                 <wp:simplePos x="0" y="0"/>
                 <wp:positionH relativeFrom="column">
                   <wp:posOffset>4029075</wp:posOffset>
@@ -1016,7 +1358,7 @@
           </mc:Choice>
           <mc:Fallback>
             <w:pict>
-              <v:line w14:anchorId="5E30AD7F" id="Straight Connector 7" o:spid="_x0000_s1026" style="position:absolute;left:0;text-align:left;z-index:251673600;visibility:visible;mso-wrap-style:square;mso-wrap-distance-left:9pt;mso-wrap-distance-top:0;mso-wrap-distance-right:9pt;mso-wrap-distance-bottom:0;mso-position-horizontal:absolute;mso-position-horizontal-relative:text;mso-position-vertical:absolute;mso-position-vertical-relative:text" from="317.25pt,355.9pt" to="540pt,355.9pt" o:gfxdata="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" strokecolor="black [3200]" strokeweight="3pt">
+              <v:line w14:anchorId="5835FBC9" id="Straight Connector 7" o:spid="_x0000_s1026" style="position:absolute;left:0;text-align:left;z-index:251651072;visibility:visible;mso-wrap-style:square;mso-wrap-distance-left:9pt;mso-wrap-distance-top:0;mso-wrap-distance-right:9pt;mso-wrap-distance-bottom:0;mso-position-horizontal:absolute;mso-position-horizontal-relative:text;mso-position-vertical:absolute;mso-position-vertical-relative:text" from="317.25pt,355.9pt" to="540pt,355.9pt" o:gfxdata="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" strokecolor="black [3200]" strokeweight="3pt">
                 <v:shadow on="t" color="black" opacity="22937f" origin=",.5" offset="0,.63889mm"/>
               </v:line>
             </w:pict>
@@ -1034,7 +1376,7 @@
         <mc:AlternateContent>
           <mc:Choice Requires="wps">
             <w:drawing>
-              <wp:anchor distT="0" distB="0" distL="114300" distR="114300" simplePos="0" relativeHeight="251691520" behindDoc="0" locked="0" layoutInCell="1" allowOverlap="1" wp14:anchorId="6B3CB189" wp14:editId="0AB30B25">
+              <wp:anchor distT="0" distB="0" distL="114300" distR="114300" simplePos="0" relativeHeight="251660288" behindDoc="0" locked="0" layoutInCell="1" allowOverlap="1" wp14:anchorId="6B3CB189" wp14:editId="0AB30B25">
                 <wp:simplePos x="0" y="0"/>
                 <wp:positionH relativeFrom="column">
                   <wp:posOffset>0</wp:posOffset>
@@ -1083,7 +1425,7 @@
           </mc:Choice>
           <mc:Fallback>
             <w:pict>
-              <v:line w14:anchorId="0E7787FF" id="Straight Connector 7" o:spid="_x0000_s1026" style="position:absolute;left:0;text-align:left;z-index:251691520;visibility:visible;mso-wrap-style:square;mso-wrap-distance-left:9pt;mso-wrap-distance-top:0;mso-wrap-distance-right:9pt;mso-wrap-distance-bottom:0;mso-position-horizontal:absolute;mso-position-horizontal-relative:text;mso-position-vertical:absolute;mso-position-vertical-relative:text" from="0,355.9pt" to="222.75pt,355.9pt" o:gfxdata="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" strokecolor="black [3200]" strokeweight="3pt">
+              <v:line w14:anchorId="1BAF19C6" id="Straight Connector 7" o:spid="_x0000_s1026" style="position:absolute;left:0;text-align:left;z-index:251660288;visibility:visible;mso-wrap-style:square;mso-wrap-distance-left:9pt;mso-wrap-distance-top:0;mso-wrap-distance-right:9pt;mso-wrap-distance-bottom:0;mso-position-horizontal:absolute;mso-position-horizontal-relative:text;mso-position-vertical:absolute;mso-position-vertical-relative:text" from="0,355.9pt" to="222.75pt,355.9pt" o:gfxdata="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" strokecolor="black [3200]" strokeweight="3pt">
                 <v:shadow on="t" color="black" opacity="22937f" origin=",.5" offset="0,.63889mm"/>
               </v:line>
             </w:pict>
@@ -1101,7 +1443,7 @@
         <mc:AlternateContent>
           <mc:Choice Requires="wps">
             <w:drawing>
-              <wp:anchor distT="0" distB="0" distL="114300" distR="114300" simplePos="0" relativeHeight="251669504" behindDoc="0" locked="0" layoutInCell="1" allowOverlap="1" wp14:anchorId="6D43E285" wp14:editId="4D1AAAD7">
+              <wp:anchor distT="0" distB="0" distL="114300" distR="114300" simplePos="0" relativeHeight="251649024" behindDoc="0" locked="0" layoutInCell="1" allowOverlap="1" wp14:anchorId="6D43E285" wp14:editId="4D1AAAD7">
                 <wp:simplePos x="0" y="0"/>
                 <wp:positionH relativeFrom="column">
                   <wp:posOffset>3971925</wp:posOffset>
@@ -1150,7 +1492,7 @@
           </mc:Choice>
           <mc:Fallback>
             <w:pict>
-              <v:line w14:anchorId="32EDCEC3" id="Straight Connector 7" o:spid="_x0000_s1026" style="position:absolute;left:0;text-align:left;z-index:251669504;visibility:visible;mso-wrap-style:square;mso-wrap-distance-left:9pt;mso-wrap-distance-top:0;mso-wrap-distance-right:9pt;mso-wrap-distance-bottom:0;mso-position-horizontal:absolute;mso-position-horizontal-relative:text;mso-position-vertical:absolute;mso-position-vertical-relative:text" from="312.75pt,143.65pt" to="535.5pt,143.65pt" o:gfxdata="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" strokecolor="black [3200]" strokeweight="3pt">
+              <v:line w14:anchorId="5B949BA6" id="Straight Connector 7" o:spid="_x0000_s1026" style="position:absolute;left:0;text-align:left;z-index:251649024;visibility:visible;mso-wrap-style:square;mso-wrap-distance-left:9pt;mso-wrap-distance-top:0;mso-wrap-distance-right:9pt;mso-wrap-distance-bottom:0;mso-position-horizontal:absolute;mso-position-horizontal-relative:text;mso-position-vertical:absolute;mso-position-vertical-relative:text" from="312.75pt,143.65pt" to="535.5pt,143.65pt" o:gfxdata="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" strokecolor="black [3200]" strokeweight="3pt">
                 <v:shadow on="t" color="black" opacity="22937f" origin=",.5" offset="0,.63889mm"/>
               </v:line>
             </w:pict>
@@ -1168,7 +1510,7 @@
         <mc:AlternateContent>
           <mc:Choice Requires="wps">
             <w:drawing>
-              <wp:anchor distT="0" distB="0" distL="114300" distR="114300" simplePos="0" relativeHeight="251690496" behindDoc="0" locked="0" layoutInCell="1" allowOverlap="1" wp14:anchorId="02CCE42C" wp14:editId="7CFB5E60">
+              <wp:anchor distT="0" distB="0" distL="114300" distR="114300" simplePos="0" relativeHeight="251657216" behindDoc="0" locked="0" layoutInCell="1" allowOverlap="1" wp14:anchorId="02CCE42C" wp14:editId="7CFB5E60">
                 <wp:simplePos x="0" y="0"/>
                 <wp:positionH relativeFrom="column">
                   <wp:posOffset>66040</wp:posOffset>
@@ -1217,7 +1559,7 @@
           </mc:Choice>
           <mc:Fallback>
             <w:pict>
-              <v:line w14:anchorId="3D20C13C" id="Straight Connector 7" o:spid="_x0000_s1026" style="position:absolute;left:0;text-align:left;z-index:251690496;visibility:visible;mso-wrap-style:square;mso-wrap-distance-left:9pt;mso-wrap-distance-top:0;mso-wrap-distance-right:9pt;mso-wrap-distance-bottom:0;mso-position-horizontal:absolute;mso-position-horizontal-relative:text;mso-position-vertical:absolute;mso-position-vertical-relative:text" from="5.2pt,154.15pt" to="227.95pt,154.15pt" o:gfxdata="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" strokecolor="black [3200]" strokeweight="3pt">
+              <v:line w14:anchorId="09E287F7" id="Straight Connector 7" o:spid="_x0000_s1026" style="position:absolute;left:0;text-align:left;z-index:251657216;visibility:visible;mso-wrap-style:square;mso-wrap-distance-left:9pt;mso-wrap-distance-top:0;mso-wrap-distance-right:9pt;mso-wrap-distance-bottom:0;mso-position-horizontal:absolute;mso-position-horizontal-relative:text;mso-position-vertical:absolute;mso-position-vertical-relative:text" from="5.2pt,154.15pt" to="227.95pt,154.15pt" o:gfxdata="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" strokecolor="black [3200]" strokeweight="3pt">
                 <v:shadow on="t" color="black" opacity="22937f" origin=",.5" offset="0,.63889mm"/>
               </v:line>
             </w:pict>
@@ -1226,148 +1568,12 @@
       </w:r>
       <w:r>
         <w:rPr>
-          <w:b/>
-          <w:noProof/>
-          <w:sz w:val="44"/>
-          <w:szCs w:val="44"/>
-          <w:lang w:bidi="ar-EG"/>
-        </w:rPr>
-        <w:drawing>
-          <wp:anchor distT="0" distB="0" distL="114300" distR="114300" simplePos="0" relativeHeight="251648512" behindDoc="0" locked="0" layoutInCell="1" allowOverlap="1" wp14:anchorId="24A338CF" wp14:editId="7D6502E6">
-            <wp:simplePos x="0" y="0"/>
-            <wp:positionH relativeFrom="column">
-              <wp:posOffset>66675</wp:posOffset>
-            </wp:positionH>
-            <wp:positionV relativeFrom="paragraph">
-              <wp:posOffset>2129155</wp:posOffset>
-            </wp:positionV>
-            <wp:extent cx="2809875" cy="1095375"/>
-            <wp:effectExtent l="0" t="0" r="9525" b="9525"/>
-            <wp:wrapNone/>
-            <wp:docPr id="1605781457" name="Picture 3"/>
-            <wp:cNvGraphicFramePr>
-              <a:graphicFrameLocks xmlns:a="http://schemas.openxmlformats.org/drawingml/2006/main" noChangeAspect="1"/>
-            </wp:cNvGraphicFramePr>
-            <a:graphic xmlns:a="http://schemas.openxmlformats.org/drawingml/2006/main">
-              <a:graphicData uri="http://schemas.openxmlformats.org/drawingml/2006/picture">
-                <pic:pic xmlns:pic="http://schemas.openxmlformats.org/drawingml/2006/picture">
-                  <pic:nvPicPr>
-                    <pic:cNvPr id="0" name="Picture 1"/>
-                    <pic:cNvPicPr>
-                      <a:picLocks noChangeAspect="1" noChangeArrowheads="1"/>
-                    </pic:cNvPicPr>
-                  </pic:nvPicPr>
-                  <pic:blipFill>
-                    <a:blip r:embed="rId10" cstate="print">
-                      <a:extLst>
-                        <a:ext uri="{28A0092B-C50C-407E-A947-70E740481C1C}">
-                          <a14:useLocalDpi xmlns:a14="http://schemas.microsoft.com/office/drawing/2010/main" val="0"/>
-                        </a:ext>
-                      </a:extLst>
-                    </a:blip>
-                    <a:srcRect/>
-                    <a:stretch>
-                      <a:fillRect/>
-                    </a:stretch>
-                  </pic:blipFill>
-                  <pic:spPr bwMode="auto">
-                    <a:xfrm>
-                      <a:off x="0" y="0"/>
-                      <a:ext cx="2809875" cy="1095375"/>
-                    </a:xfrm>
-                    <a:prstGeom prst="rect">
-                      <a:avLst/>
-                    </a:prstGeom>
-                    <a:noFill/>
-                    <a:ln>
-                      <a:noFill/>
-                    </a:ln>
-                  </pic:spPr>
-                </pic:pic>
-              </a:graphicData>
-            </a:graphic>
-          </wp:anchor>
-        </w:drawing>
-      </w:r>
-      <w:r>
-        <w:rPr>
-          <w:b/>
-          <w:noProof/>
-          <w:sz w:val="44"/>
-          <w:szCs w:val="44"/>
-          <w:lang w:bidi="ar-EG"/>
-        </w:rPr>
-        <w:drawing>
-          <wp:anchor distT="0" distB="0" distL="114300" distR="114300" simplePos="0" relativeHeight="251688448" behindDoc="0" locked="0" layoutInCell="1" allowOverlap="1" wp14:anchorId="153AE360" wp14:editId="704412C4">
-            <wp:simplePos x="0" y="0"/>
-            <wp:positionH relativeFrom="column">
-              <wp:posOffset>5172075</wp:posOffset>
-            </wp:positionH>
-            <wp:positionV relativeFrom="paragraph">
-              <wp:posOffset>1957705</wp:posOffset>
-            </wp:positionV>
-            <wp:extent cx="1419226" cy="1419226"/>
-            <wp:effectExtent l="0" t="0" r="0" b="0"/>
-            <wp:wrapNone/>
-            <wp:docPr id="1855672123" name="Picture 5"/>
-            <wp:cNvGraphicFramePr>
-              <a:graphicFrameLocks xmlns:a="http://schemas.openxmlformats.org/drawingml/2006/main" noChangeAspect="1"/>
-            </wp:cNvGraphicFramePr>
-            <a:graphic xmlns:a="http://schemas.openxmlformats.org/drawingml/2006/main">
-              <a:graphicData uri="http://schemas.openxmlformats.org/drawingml/2006/picture">
-                <pic:pic xmlns:pic="http://schemas.openxmlformats.org/drawingml/2006/picture">
-                  <pic:nvPicPr>
-                    <pic:cNvPr id="0" name="Picture 3"/>
-                    <pic:cNvPicPr>
-                      <a:picLocks noChangeAspect="1" noChangeArrowheads="1"/>
-                    </pic:cNvPicPr>
-                  </pic:nvPicPr>
-                  <pic:blipFill>
-                    <a:blip r:embed="rId11">
-                      <a:extLst>
-                        <a:ext uri="{28A0092B-C50C-407E-A947-70E740481C1C}">
-                          <a14:useLocalDpi xmlns:a14="http://schemas.microsoft.com/office/drawing/2010/main" val="0"/>
-                        </a:ext>
-                      </a:extLst>
-                    </a:blip>
-                    <a:srcRect/>
-                    <a:stretch>
-                      <a:fillRect/>
-                    </a:stretch>
-                  </pic:blipFill>
-                  <pic:spPr bwMode="auto">
-                    <a:xfrm>
-                      <a:off x="0" y="0"/>
-                      <a:ext cx="1419226" cy="1419226"/>
-                    </a:xfrm>
-                    <a:prstGeom prst="rect">
-                      <a:avLst/>
-                    </a:prstGeom>
-                    <a:noFill/>
-                    <a:ln>
-                      <a:noFill/>
-                    </a:ln>
-                  </pic:spPr>
-                </pic:pic>
-              </a:graphicData>
-            </a:graphic>
-            <wp14:sizeRelH relativeFrom="margin">
-              <wp14:pctWidth>0</wp14:pctWidth>
-            </wp14:sizeRelH>
-            <wp14:sizeRelV relativeFrom="margin">
-              <wp14:pctHeight>0</wp14:pctHeight>
-            </wp14:sizeRelV>
-          </wp:anchor>
-        </w:drawing>
-      </w:r>
-      <w:r>
-        <w:rPr>
           <w:noProof/>
         </w:rPr>
         <mc:AlternateContent>
           <mc:Choice Requires="wps">
             <w:drawing>
-              <wp:anchor distT="45720" distB="45720" distL="114300" distR="114300" simplePos="0" relativeHeight="251635200" behindDoc="0" locked="0" layoutInCell="1" allowOverlap="1" wp14:anchorId="61189400" wp14:editId="5B346127">
+              <wp:anchor distT="45720" distB="45720" distL="114300" distR="114300" simplePos="0" relativeHeight="251635200" behindDoc="0" locked="0" layoutInCell="1" allowOverlap="1" wp14:anchorId="61189400" wp14:editId="7B2F28B0">
                 <wp:simplePos x="0" y="0"/>
                 <wp:positionH relativeFrom="column">
                   <wp:posOffset>2091690</wp:posOffset>
@@ -1451,7 +1657,7 @@
           </mc:Choice>
           <mc:Fallback>
             <w:pict>
-              <v:shape w14:anchorId="61189400" id="_x0000_s1027" type="#_x0000_t202" style="position:absolute;margin-left:164.7pt;margin-top:365.5pt;width:3in;height:110.6pt;z-index:251635200;visibility:visible;mso-wrap-style:square;mso-width-percent:0;mso-height-percent:0;mso-wrap-distance-left:9pt;mso-wrap-distance-top:3.6pt;mso-wrap-distance-right:9pt;mso-wrap-distance-bottom:3.6pt;mso-position-horizontal:absolute;mso-position-horizontal-relative:text;mso-position-vertical:absolute;mso-position-vertical-relative:text;mso-width-percent:0;mso-height-percent:0;mso-width-relative:margin;mso-height-relative:margin;v-text-anchor:top" o:gfxdata="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">
+              <v:shape w14:anchorId="61189400" id="_x0000_s1028" type="#_x0000_t202" style="position:absolute;margin-left:164.7pt;margin-top:365.5pt;width:3in;height:110.6pt;z-index:251635200;visibility:visible;mso-wrap-style:square;mso-width-percent:0;mso-height-percent:0;mso-wrap-distance-left:9pt;mso-wrap-distance-top:3.6pt;mso-wrap-distance-right:9pt;mso-wrap-distance-bottom:3.6pt;mso-position-horizontal:absolute;mso-position-horizontal-relative:text;mso-position-vertical:absolute;mso-position-vertical-relative:text;mso-width-percent:0;mso-height-percent:0;mso-width-relative:margin;mso-height-relative:margin;v-text-anchor:top" o:gfxdata="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">
                 <v:textbox style="mso-fit-shape-to-text:t">
                   <w:txbxContent>
                     <w:p>
@@ -1575,7 +1781,7 @@
           </mc:Choice>
           <mc:Fallback>
             <w:pict>
-              <v:shape w14:anchorId="697B61FF" id="_x0000_s1028" type="#_x0000_t202" style="position:absolute;margin-left:161.15pt;margin-top:470.55pt;width:3in;height:110.6pt;z-index:251624960;visibility:visible;mso-wrap-style:square;mso-width-percent:0;mso-height-percent:200;mso-wrap-distance-left:9pt;mso-wrap-distance-top:3.6pt;mso-wrap-distance-right:9pt;mso-wrap-distance-bottom:3.6pt;mso-position-horizontal:absolute;mso-position-horizontal-relative:text;mso-position-vertical:absolute;mso-position-vertical-relative:text;mso-width-percent:0;mso-height-percent:200;mso-width-relative:margin;mso-height-relative:margin;v-text-anchor:top" o:gfxdata="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">
+              <v:shape w14:anchorId="697B61FF" id="_x0000_s1029" type="#_x0000_t202" style="position:absolute;margin-left:161.15pt;margin-top:470.55pt;width:3in;height:110.6pt;z-index:251624960;visibility:visible;mso-wrap-style:square;mso-width-percent:0;mso-height-percent:200;mso-wrap-distance-left:9pt;mso-wrap-distance-top:3.6pt;mso-wrap-distance-right:9pt;mso-wrap-distance-bottom:3.6pt;mso-position-horizontal:absolute;mso-position-horizontal-relative:text;mso-position-vertical:absolute;mso-position-vertical-relative:text;mso-width-percent:0;mso-height-percent:200;mso-width-relative:margin;mso-height-relative:margin;v-text-anchor:top" o:gfxdata="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">
                 <v:textbox style="mso-fit-shape-to-text:t">
                   <w:txbxContent>
                     <w:p>
@@ -1609,7 +1815,7 @@
       </w:r>
     </w:p>
     <w:sectPr>
-      <w:headerReference w:type="default" r:id="rId12"/>
+      <w:headerReference w:type="default" r:id="rId11"/>
       <w:pgSz w:w="12240" w:h="15840"/>
       <w:pgMar w:top="720" w:right="720" w:bottom="720" w:left="720" w:header="720" w:footer="720" w:gutter="0"/>
       <w:pgBorders w:offsetFrom="page">
@@ -2321,7 +2527,6 @@
   <w:style w:type="character" w:default="1" w:styleId="DefaultParagraphFont">
     <w:name w:val="Default Paragraph Font"/>
     <w:uiPriority w:val="1"/>
-    <w:semiHidden/>
     <w:unhideWhenUsed/>
   </w:style>
   <w:style w:type="table" w:default="1" w:styleId="TableNormal">
@@ -2461,6 +2666,29 @@
       <w:ind w:left="720"/>
       <w:contextualSpacing/>
     </w:pPr>
+  </w:style>
+  <w:style w:type="character" w:styleId="Hyperlink">
+    <w:name w:val="Hyperlink"/>
+    <w:basedOn w:val="DefaultParagraphFont"/>
+    <w:uiPriority w:val="99"/>
+    <w:unhideWhenUsed/>
+    <w:rsid w:val="00A930F9"/>
+    <w:rPr>
+      <w:color w:val="0000FF" w:themeColor="hyperlink"/>
+      <w:u w:val="single"/>
+    </w:rPr>
+  </w:style>
+  <w:style w:type="character" w:styleId="UnresolvedMention">
+    <w:name w:val="Unresolved Mention"/>
+    <w:basedOn w:val="DefaultParagraphFont"/>
+    <w:uiPriority w:val="99"/>
+    <w:semiHidden/>
+    <w:unhideWhenUsed/>
+    <w:rsid w:val="00A930F9"/>
+    <w:rPr>
+      <w:color w:val="605E5C"/>
+      <w:shd w:val="clear" w:color="auto" w:fill="E1DFDD"/>
+    </w:rPr>
   </w:style>
 </w:styles>
 </file>

</xml_diff>